<commit_message>
cv: resync showcase CV artifacts
</commit_message>
<xml_diff>
--- a/showcase_assets/CV/DINH_CONG_THANH_FULL_CAPABILITY_CV.docx
+++ b/showcase_assets/CV/DINH_CONG_THANH_FULL_CAPABILITY_CV.docx
@@ -800,25 +800,112 @@
     </w:p>
     <w:p>
       <w:pPr>
+        <w:pStyle w:val="ListBullet"/>
         <w:jc w:val="both"/>
       </w:pPr>
       <w:r>
         <w:rPr>
           <w:rFonts w:ascii="Consolas" w:hAnsi="Consolas"/>
+          <w:b w:val="0"/>
+          <w:i w:val="0"/>
+          <w:sz w:val="22"/>
+        </w:rPr>
+        <w:t xml:space="preserve">Built modern knowledge-assisted workflow tooling with </w:t>
+      </w:r>
+      <w:r>
+        <w:rPr>
+          <w:rFonts w:ascii="Consolas" w:hAnsi="Consolas"/>
+          <w:b w:val="0"/>
+          <w:i w:val="0"/>
+          <w:color w:val="E67E22"/>
+          <w:sz w:val="22"/>
+        </w:rPr>
+        <w:t>React</w:t>
+      </w:r>
+      <w:r>
+        <w:rPr>
+          <w:rFonts w:ascii="Consolas" w:hAnsi="Consolas"/>
+          <w:b w:val="0"/>
+          <w:i w:val="0"/>
+          <w:sz w:val="22"/>
+        </w:rPr>
+        <w:t xml:space="preserve">, </w:t>
+      </w:r>
+      <w:r>
+        <w:rPr>
+          <w:rFonts w:ascii="Consolas" w:hAnsi="Consolas"/>
+          <w:b w:val="0"/>
+          <w:i w:val="0"/>
+          <w:color w:val="E67E22"/>
+          <w:sz w:val="22"/>
+        </w:rPr>
+        <w:t>FastAPI</w:t>
+      </w:r>
+      <w:r>
+        <w:rPr>
+          <w:rFonts w:ascii="Consolas" w:hAnsi="Consolas"/>
+          <w:b w:val="0"/>
+          <w:i w:val="0"/>
+          <w:sz w:val="22"/>
+        </w:rPr>
+        <w:t xml:space="preserve">, MCP patterns, </w:t>
+      </w:r>
+      <w:r>
+        <w:rPr>
+          <w:rFonts w:ascii="Consolas" w:hAnsi="Consolas"/>
+          <w:b w:val="0"/>
+          <w:i w:val="0"/>
+          <w:color w:val="E67E22"/>
+          <w:sz w:val="22"/>
+        </w:rPr>
+        <w:t>LangChain</w:t>
+      </w:r>
+      <w:r>
+        <w:rPr>
+          <w:rFonts w:ascii="Consolas" w:hAnsi="Consolas"/>
+          <w:b w:val="0"/>
+          <w:i w:val="0"/>
+          <w:sz w:val="22"/>
+        </w:rPr>
+        <w:t xml:space="preserve">, and </w:t>
+      </w:r>
+      <w:r>
+        <w:rPr>
+          <w:rFonts w:ascii="Consolas" w:hAnsi="Consolas"/>
+          <w:b w:val="0"/>
+          <w:i w:val="0"/>
+          <w:color w:val="E67E22"/>
+          <w:sz w:val="22"/>
+        </w:rPr>
+        <w:t>Chroma</w:t>
+      </w:r>
+      <w:r>
+        <w:rPr>
+          <w:rFonts w:ascii="Consolas" w:hAnsi="Consolas"/>
+          <w:b w:val="0"/>
+          <w:i w:val="0"/>
+          <w:sz w:val="22"/>
+        </w:rPr>
+        <w:t xml:space="preserve"> to combine project context, retrieval, and proactive risk guidance in a single operator flow, reducing issue-triage and context-gathering time by </w:t>
+      </w:r>
+      <w:r>
+        <w:rPr>
+          <w:rFonts w:ascii="Consolas" w:hAnsi="Consolas"/>
           <w:b/>
-          <w:i/>
-          <w:sz w:val="24"/>
-        </w:rPr>
-        <w:t>Personal Project</w:t>
-      </w:r>
-      <w:r>
-        <w:rPr>
-          <w:rFonts w:ascii="Consolas" w:hAnsi="Consolas"/>
-          <w:b w:val="0"/>
-          <w:i w:val="0"/>
-          <w:sz w:val="24"/>
-        </w:rPr>
-        <w:t xml:space="preserve"> | Render CV Automation and MP4 Processing &amp; Translation Platform</w:t>
+          <w:i w:val="0"/>
+          <w:color w:val="0066CC"/>
+          <w:sz w:val="22"/>
+        </w:rPr>
+        <w:t>~35%</w:t>
+      </w:r>
+      <w:r>
+        <w:rPr>
+          <w:rFonts w:ascii="Consolas" w:hAnsi="Consolas"/>
+          <w:b w:val="0"/>
+          <w:i w:val="0"/>
+          <w:sz w:val="22"/>
+        </w:rPr>
+        <w:t>.</w:t>
       </w:r>
     </w:p>
     <w:p>
@@ -833,7 +920,7 @@
           <w:i w:val="0"/>
           <w:sz w:val="22"/>
         </w:rPr>
-        <w:t xml:space="preserve">Orchestrated an end-to-end </w:t>
+        <w:t xml:space="preserve">Built an LLM-assisted slide-generation workflow with </w:t>
       </w:r>
       <w:r>
         <w:rPr>
@@ -843,16 +930,96 @@
           <w:color w:val="E67E22"/>
           <w:sz w:val="22"/>
         </w:rPr>
-        <w:t>AI automation</w:t>
-      </w:r>
-      <w:r>
-        <w:rPr>
-          <w:rFonts w:ascii="Consolas" w:hAnsi="Consolas"/>
-          <w:b w:val="0"/>
-          <w:i w:val="0"/>
-          <w:sz w:val="22"/>
-        </w:rPr>
-        <w:t xml:space="preserve"> platform for job applications: LinkedIn crawling, normalization, triage queues, CV/JD fit evaluation, and assisted apply workflows in a single operational dashboard.</w:t>
+        <w:t>Python</w:t>
+      </w:r>
+      <w:r>
+        <w:rPr>
+          <w:rFonts w:ascii="Consolas" w:hAnsi="Consolas"/>
+          <w:b w:val="0"/>
+          <w:i w:val="0"/>
+          <w:sz w:val="22"/>
+        </w:rPr>
+        <w:t xml:space="preserve">, Mermaid, and an </w:t>
+      </w:r>
+      <w:r>
+        <w:rPr>
+          <w:rFonts w:ascii="Consolas" w:hAnsi="Consolas"/>
+          <w:b w:val="0"/>
+          <w:i w:val="0"/>
+          <w:color w:val="E67E22"/>
+          <w:sz w:val="22"/>
+        </w:rPr>
+        <w:t>Angular</w:t>
+      </w:r>
+      <w:r>
+        <w:rPr>
+          <w:rFonts w:ascii="Consolas" w:hAnsi="Consolas"/>
+          <w:b w:val="0"/>
+          <w:i w:val="0"/>
+          <w:sz w:val="22"/>
+        </w:rPr>
+        <w:t xml:space="preserve">-based UI to turn prompts and structured inputs into presentation-ready outlines, diagrams, and editable content, reducing manual first-draft slide preparation time by </w:t>
+      </w:r>
+      <w:r>
+        <w:rPr>
+          <w:rFonts w:ascii="Consolas" w:hAnsi="Consolas"/>
+          <w:b/>
+          <w:i w:val="0"/>
+          <w:color w:val="0066CC"/>
+          <w:sz w:val="22"/>
+        </w:rPr>
+        <w:t>~70%</w:t>
+      </w:r>
+      <w:r>
+        <w:rPr>
+          <w:rFonts w:ascii="Consolas" w:hAnsi="Consolas"/>
+          <w:b w:val="0"/>
+          <w:i w:val="0"/>
+          <w:sz w:val="22"/>
+        </w:rPr>
+        <w:t xml:space="preserve"> while </w:t>
+      </w:r>
+      <w:r>
+        <w:rPr>
+          <w:rFonts w:ascii="Consolas" w:hAnsi="Consolas"/>
+          <w:b/>
+          <w:i w:val="0"/>
+          <w:color w:val="0066CC"/>
+          <w:sz w:val="22"/>
+        </w:rPr>
+        <w:t>improving</w:t>
+      </w:r>
+      <w:r>
+        <w:rPr>
+          <w:rFonts w:ascii="Consolas" w:hAnsi="Consolas"/>
+          <w:b w:val="0"/>
+          <w:i w:val="0"/>
+          <w:sz w:val="22"/>
+        </w:rPr>
+        <w:t xml:space="preserve"> output consistency across iterations.</w:t>
+      </w:r>
+    </w:p>
+    <w:p>
+      <w:pPr>
+        <w:jc w:val="both"/>
+      </w:pPr>
+      <w:r>
+        <w:rPr>
+          <w:rFonts w:ascii="Consolas" w:hAnsi="Consolas"/>
+          <w:b/>
+          <w:i/>
+          <w:sz w:val="24"/>
+        </w:rPr>
+        <w:t>Personal Project</w:t>
+      </w:r>
+      <w:r>
+        <w:rPr>
+          <w:rFonts w:ascii="Consolas" w:hAnsi="Consolas"/>
+          <w:b w:val="0"/>
+          <w:i w:val="0"/>
+          <w:sz w:val="24"/>
+        </w:rPr>
+        <w:t xml:space="preserve"> | Render CV Automation and MP4 Processing &amp; Translation Platform</w:t>
       </w:r>
     </w:p>
     <w:p>
@@ -867,7 +1034,7 @@
           <w:i w:val="0"/>
           <w:sz w:val="22"/>
         </w:rPr>
-        <w:t xml:space="preserve">Implemented a production-style </w:t>
+        <w:t xml:space="preserve">Orchestrated an end-to-end </w:t>
       </w:r>
       <w:r>
         <w:rPr>
@@ -877,35 +1044,16 @@
           <w:color w:val="E67E22"/>
           <w:sz w:val="22"/>
         </w:rPr>
-        <w:t>RAG</w:t>
-      </w:r>
-      <w:r>
-        <w:rPr>
-          <w:rFonts w:ascii="Consolas" w:hAnsi="Consolas"/>
-          <w:b w:val="0"/>
-          <w:i w:val="0"/>
-          <w:sz w:val="22"/>
-        </w:rPr>
-        <w:t xml:space="preserve"> pipeline on </w:t>
-      </w:r>
-      <w:r>
-        <w:rPr>
-          <w:rFonts w:ascii="Consolas" w:hAnsi="Consolas"/>
-          <w:b w:val="0"/>
-          <w:i w:val="0"/>
-          <w:color w:val="E67E22"/>
-          <w:sz w:val="22"/>
-        </w:rPr>
-        <w:t>SQLite</w:t>
-      </w:r>
-      <w:r>
-        <w:rPr>
-          <w:rFonts w:ascii="Consolas" w:hAnsi="Consolas"/>
-          <w:b w:val="0"/>
-          <w:i w:val="0"/>
-          <w:sz w:val="22"/>
-        </w:rPr>
-        <w:t>: embedding + hybrid retrieval (semantic/keyword/metadata), reranking, evidence mapping, and prompt contracts to keep outputs grounded and auditable.</w:t>
+        <w:t>AI automation</w:t>
+      </w:r>
+      <w:r>
+        <w:rPr>
+          <w:rFonts w:ascii="Consolas" w:hAnsi="Consolas"/>
+          <w:b w:val="0"/>
+          <w:i w:val="0"/>
+          <w:sz w:val="22"/>
+        </w:rPr>
+        <w:t xml:space="preserve"> platform for job applications: LinkedIn crawling, normalization, triage queues, CV/JD fit evaluation, and assisted apply workflows in a single operational dashboard.</w:t>
       </w:r>
     </w:p>
     <w:p>
@@ -920,45 +1068,45 @@
           <w:i w:val="0"/>
           <w:sz w:val="22"/>
         </w:rPr>
-        <w:t xml:space="preserve">Added reliability gates and deterministic fallbacks (no-op rewrite detection, coverage deltas, constraint filters, mandatory cover-letter enforcement), </w:t>
-      </w:r>
-      <w:r>
-        <w:rPr>
-          <w:rFonts w:ascii="Consolas" w:hAnsi="Consolas"/>
-          <w:b/>
-          <w:i w:val="0"/>
-          <w:color w:val="0066CC"/>
-          <w:sz w:val="22"/>
-        </w:rPr>
-        <w:t>improving</w:t>
-      </w:r>
-      <w:r>
-        <w:rPr>
-          <w:rFonts w:ascii="Consolas" w:hAnsi="Consolas"/>
-          <w:b w:val="0"/>
-          <w:i w:val="0"/>
-          <w:sz w:val="22"/>
-        </w:rPr>
-        <w:t xml:space="preserve"> stability on CPU-only hardware and reducing failed runs by </w:t>
-      </w:r>
-      <w:r>
-        <w:rPr>
-          <w:rFonts w:ascii="Consolas" w:hAnsi="Consolas"/>
-          <w:b/>
-          <w:i w:val="0"/>
-          <w:color w:val="0066CC"/>
-          <w:sz w:val="22"/>
-        </w:rPr>
-        <w:t>~40%</w:t>
-      </w:r>
-      <w:r>
-        <w:rPr>
-          <w:rFonts w:ascii="Consolas" w:hAnsi="Consolas"/>
-          <w:b w:val="0"/>
-          <w:i w:val="0"/>
-          <w:sz w:val="22"/>
-        </w:rPr>
-        <w:t>.</w:t>
+        <w:t xml:space="preserve">Implemented a production-style </w:t>
+      </w:r>
+      <w:r>
+        <w:rPr>
+          <w:rFonts w:ascii="Consolas" w:hAnsi="Consolas"/>
+          <w:b w:val="0"/>
+          <w:i w:val="0"/>
+          <w:color w:val="E67E22"/>
+          <w:sz w:val="22"/>
+        </w:rPr>
+        <w:t>RAG</w:t>
+      </w:r>
+      <w:r>
+        <w:rPr>
+          <w:rFonts w:ascii="Consolas" w:hAnsi="Consolas"/>
+          <w:b w:val="0"/>
+          <w:i w:val="0"/>
+          <w:sz w:val="22"/>
+        </w:rPr>
+        <w:t xml:space="preserve"> pipeline on </w:t>
+      </w:r>
+      <w:r>
+        <w:rPr>
+          <w:rFonts w:ascii="Consolas" w:hAnsi="Consolas"/>
+          <w:b w:val="0"/>
+          <w:i w:val="0"/>
+          <w:color w:val="E67E22"/>
+          <w:sz w:val="22"/>
+        </w:rPr>
+        <w:t>SQLite</w:t>
+      </w:r>
+      <w:r>
+        <w:rPr>
+          <w:rFonts w:ascii="Consolas" w:hAnsi="Consolas"/>
+          <w:b w:val="0"/>
+          <w:i w:val="0"/>
+          <w:sz w:val="22"/>
+        </w:rPr>
+        <w:t>: embedding + hybrid retrieval (semantic/keyword/metadata), reranking, evidence mapping, and prompt contracts to keep outputs grounded and auditable.</w:t>
       </w:r>
     </w:p>
     <w:p>
@@ -973,45 +1121,7 @@
           <w:i w:val="0"/>
           <w:sz w:val="22"/>
         </w:rPr>
-        <w:t xml:space="preserve">Automated document workflows to render tagged plain text into consistent </w:t>
-      </w:r>
-      <w:r>
-        <w:rPr>
-          <w:rFonts w:ascii="Consolas" w:hAnsi="Consolas"/>
-          <w:b w:val="0"/>
-          <w:i w:val="0"/>
-          <w:color w:val="E67E22"/>
-          <w:sz w:val="22"/>
-        </w:rPr>
-        <w:t>DOCX/PDF</w:t>
-      </w:r>
-      <w:r>
-        <w:rPr>
-          <w:rFonts w:ascii="Consolas" w:hAnsi="Consolas"/>
-          <w:b w:val="0"/>
-          <w:i w:val="0"/>
-          <w:sz w:val="22"/>
-        </w:rPr>
-        <w:t xml:space="preserve"> artifacts (</w:t>
-      </w:r>
-      <w:r>
-        <w:rPr>
-          <w:rFonts w:ascii="Consolas" w:hAnsi="Consolas"/>
-          <w:b w:val="0"/>
-          <w:i w:val="0"/>
-          <w:color w:val="27AE60"/>
-          <w:sz w:val="22"/>
-        </w:rPr>
-        <w:t>python</w:t>
-      </w:r>
-      <w:r>
-        <w:rPr>
-          <w:rFonts w:ascii="Consolas" w:hAnsi="Consolas"/>
-          <w:b w:val="0"/>
-          <w:i w:val="0"/>
-          <w:sz w:val="22"/>
-        </w:rPr>
-        <w:t xml:space="preserve">-docx, docx2pdf), reducing manual formatting time by </w:t>
+        <w:t xml:space="preserve">Added reliability gates and deterministic fallbacks (no-op rewrite detection, coverage deltas, constraint filters, mandatory cover-letter enforcement), </w:t>
       </w:r>
       <w:r>
         <w:rPr>
@@ -1021,16 +1131,16 @@
           <w:color w:val="0066CC"/>
           <w:sz w:val="22"/>
         </w:rPr>
-        <w:t>~80%</w:t>
-      </w:r>
-      <w:r>
-        <w:rPr>
-          <w:rFonts w:ascii="Consolas" w:hAnsi="Consolas"/>
-          <w:b w:val="0"/>
-          <w:i w:val="0"/>
-          <w:sz w:val="22"/>
-        </w:rPr>
-        <w:t xml:space="preserve"> and </w:t>
+        <w:t>improving</w:t>
+      </w:r>
+      <w:r>
+        <w:rPr>
+          <w:rFonts w:ascii="Consolas" w:hAnsi="Consolas"/>
+          <w:b w:val="0"/>
+          <w:i w:val="0"/>
+          <w:sz w:val="22"/>
+        </w:rPr>
+        <w:t xml:space="preserve"> stability on CPU-only hardware and reducing failed runs by </w:t>
       </w:r>
       <w:r>
         <w:rPr>
@@ -1040,16 +1150,16 @@
           <w:color w:val="0066CC"/>
           <w:sz w:val="22"/>
         </w:rPr>
-        <w:t>improving</w:t>
-      </w:r>
-      <w:r>
-        <w:rPr>
-          <w:rFonts w:ascii="Consolas" w:hAnsi="Consolas"/>
-          <w:b w:val="0"/>
-          <w:i w:val="0"/>
-          <w:sz w:val="22"/>
-        </w:rPr>
-        <w:t xml:space="preserve"> consistency across versions.</w:t>
+        <w:t>~40%</w:t>
+      </w:r>
+      <w:r>
+        <w:rPr>
+          <w:rFonts w:ascii="Consolas" w:hAnsi="Consolas"/>
+          <w:b w:val="0"/>
+          <w:i w:val="0"/>
+          <w:sz w:val="22"/>
+        </w:rPr>
+        <w:t>.</w:t>
       </w:r>
     </w:p>
     <w:p>
@@ -1064,7 +1174,7 @@
           <w:i w:val="0"/>
           <w:sz w:val="22"/>
         </w:rPr>
-        <w:t xml:space="preserve">Contributed to a project with UI, MCP, and </w:t>
+        <w:t xml:space="preserve">Automated document workflows to render tagged plain text into consistent </w:t>
       </w:r>
       <w:r>
         <w:rPr>
@@ -1074,92 +1184,35 @@
           <w:color w:val="E67E22"/>
           <w:sz w:val="22"/>
         </w:rPr>
-        <w:t>RAG</w:t>
-      </w:r>
-      <w:r>
-        <w:rPr>
-          <w:rFonts w:ascii="Consolas" w:hAnsi="Consolas"/>
-          <w:b w:val="0"/>
-          <w:i w:val="0"/>
-          <w:sz w:val="22"/>
-        </w:rPr>
-        <w:t xml:space="preserve"> capabilities using </w:t>
-      </w:r>
-      <w:r>
-        <w:rPr>
-          <w:rFonts w:ascii="Consolas" w:hAnsi="Consolas"/>
-          <w:b w:val="0"/>
-          <w:i w:val="0"/>
-          <w:color w:val="E67E22"/>
-          <w:sz w:val="22"/>
-        </w:rPr>
-        <w:t>React</w:t>
-      </w:r>
-      <w:r>
-        <w:rPr>
-          <w:rFonts w:ascii="Consolas" w:hAnsi="Consolas"/>
-          <w:b w:val="0"/>
-          <w:i w:val="0"/>
-          <w:sz w:val="22"/>
-        </w:rPr>
-        <w:t xml:space="preserve">, </w:t>
-      </w:r>
-      <w:r>
-        <w:rPr>
-          <w:rFonts w:ascii="Consolas" w:hAnsi="Consolas"/>
-          <w:b w:val="0"/>
-          <w:i w:val="0"/>
-          <w:color w:val="E67E22"/>
-          <w:sz w:val="22"/>
-        </w:rPr>
-        <w:t>FastAPI</w:t>
-      </w:r>
-      <w:r>
-        <w:rPr>
-          <w:rFonts w:ascii="Consolas" w:hAnsi="Consolas"/>
-          <w:b w:val="0"/>
-          <w:i w:val="0"/>
-          <w:sz w:val="22"/>
-        </w:rPr>
-        <w:t xml:space="preserve">, </w:t>
-      </w:r>
-      <w:r>
-        <w:rPr>
-          <w:rFonts w:ascii="Consolas" w:hAnsi="Consolas"/>
-          <w:b w:val="0"/>
-          <w:i w:val="0"/>
-          <w:color w:val="E67E22"/>
-          <w:sz w:val="22"/>
-        </w:rPr>
-        <w:t>LangChain</w:t>
-      </w:r>
-      <w:r>
-        <w:rPr>
-          <w:rFonts w:ascii="Consolas" w:hAnsi="Consolas"/>
-          <w:b w:val="0"/>
-          <w:i w:val="0"/>
-          <w:sz w:val="22"/>
-        </w:rPr>
-        <w:t xml:space="preserve">, and </w:t>
-      </w:r>
-      <w:r>
-        <w:rPr>
-          <w:rFonts w:ascii="Consolas" w:hAnsi="Consolas"/>
-          <w:b w:val="0"/>
-          <w:i w:val="0"/>
-          <w:color w:val="E67E22"/>
-          <w:sz w:val="22"/>
-        </w:rPr>
-        <w:t>Chroma</w:t>
-      </w:r>
-      <w:r>
-        <w:rPr>
-          <w:rFonts w:ascii="Consolas" w:hAnsi="Consolas"/>
-          <w:b w:val="0"/>
-          <w:i w:val="0"/>
-          <w:sz w:val="22"/>
-        </w:rPr>
-        <w:t xml:space="preserve"> to support project management from existing knowledge, proactively surface delivery risks, and recommend practical mitigation actions, reducing issue-triage and context-gathering time by </w:t>
+        <w:t>DOCX/PDF</w:t>
+      </w:r>
+      <w:r>
+        <w:rPr>
+          <w:rFonts w:ascii="Consolas" w:hAnsi="Consolas"/>
+          <w:b w:val="0"/>
+          <w:i w:val="0"/>
+          <w:sz w:val="22"/>
+        </w:rPr>
+        <w:t xml:space="preserve"> artifacts (</w:t>
+      </w:r>
+      <w:r>
+        <w:rPr>
+          <w:rFonts w:ascii="Consolas" w:hAnsi="Consolas"/>
+          <w:b w:val="0"/>
+          <w:i w:val="0"/>
+          <w:color w:val="27AE60"/>
+          <w:sz w:val="22"/>
+        </w:rPr>
+        <w:t>python</w:t>
+      </w:r>
+      <w:r>
+        <w:rPr>
+          <w:rFonts w:ascii="Consolas" w:hAnsi="Consolas"/>
+          <w:b w:val="0"/>
+          <w:i w:val="0"/>
+          <w:sz w:val="22"/>
+        </w:rPr>
+        <w:t xml:space="preserve">-docx, docx2pdf), reducing manual formatting time by </w:t>
       </w:r>
       <w:r>
         <w:rPr>
@@ -1169,69 +1222,16 @@
           <w:color w:val="0066CC"/>
           <w:sz w:val="22"/>
         </w:rPr>
-        <w:t>~35%</w:t>
-      </w:r>
-      <w:r>
-        <w:rPr>
-          <w:rFonts w:ascii="Consolas" w:hAnsi="Consolas"/>
-          <w:b w:val="0"/>
-          <w:i w:val="0"/>
-          <w:sz w:val="22"/>
-        </w:rPr>
-        <w:t>.</w:t>
-      </w:r>
-    </w:p>
-    <w:p>
-      <w:pPr>
-        <w:pStyle w:val="ListBullet"/>
-        <w:jc w:val="both"/>
-      </w:pPr>
-      <w:r>
-        <w:rPr>
-          <w:rFonts w:ascii="Consolas" w:hAnsi="Consolas"/>
-          <w:b w:val="0"/>
-          <w:i w:val="0"/>
-          <w:sz w:val="22"/>
-        </w:rPr>
-        <w:t xml:space="preserve">Built a slide-generation project using </w:t>
-      </w:r>
-      <w:r>
-        <w:rPr>
-          <w:rFonts w:ascii="Consolas" w:hAnsi="Consolas"/>
-          <w:b w:val="0"/>
-          <w:i w:val="0"/>
-          <w:color w:val="E67E22"/>
-          <w:sz w:val="22"/>
-        </w:rPr>
-        <w:t>Python</w:t>
-      </w:r>
-      <w:r>
-        <w:rPr>
-          <w:rFonts w:ascii="Consolas" w:hAnsi="Consolas"/>
-          <w:b w:val="0"/>
-          <w:i w:val="0"/>
-          <w:sz w:val="22"/>
-        </w:rPr>
-        <w:t xml:space="preserve">, LLMs, Mermaid, and an </w:t>
-      </w:r>
-      <w:r>
-        <w:rPr>
-          <w:rFonts w:ascii="Consolas" w:hAnsi="Consolas"/>
-          <w:b w:val="0"/>
-          <w:i w:val="0"/>
-          <w:color w:val="E67E22"/>
-          <w:sz w:val="22"/>
-        </w:rPr>
-        <w:t>Angular</w:t>
-      </w:r>
-      <w:r>
-        <w:rPr>
-          <w:rFonts w:ascii="Consolas" w:hAnsi="Consolas"/>
-          <w:b w:val="0"/>
-          <w:i w:val="0"/>
-          <w:sz w:val="22"/>
-        </w:rPr>
-        <w:t xml:space="preserve">-based UI to transform prompts and structured inputs into presentation-ready slide outlines, diagrams, and editable content, reducing manual first-draft slide preparation time by </w:t>
+        <w:t>~80%</w:t>
+      </w:r>
+      <w:r>
+        <w:rPr>
+          <w:rFonts w:ascii="Consolas" w:hAnsi="Consolas"/>
+          <w:b w:val="0"/>
+          <w:i w:val="0"/>
+          <w:sz w:val="22"/>
+        </w:rPr>
+        <w:t xml:space="preserve"> and </w:t>
       </w:r>
       <w:r>
         <w:rPr>
@@ -1241,25 +1241,6 @@
           <w:color w:val="0066CC"/>
           <w:sz w:val="22"/>
         </w:rPr>
-        <w:t>~70%</w:t>
-      </w:r>
-      <w:r>
-        <w:rPr>
-          <w:rFonts w:ascii="Consolas" w:hAnsi="Consolas"/>
-          <w:b w:val="0"/>
-          <w:i w:val="0"/>
-          <w:sz w:val="22"/>
-        </w:rPr>
-        <w:t xml:space="preserve"> and </w:t>
-      </w:r>
-      <w:r>
-        <w:rPr>
-          <w:rFonts w:ascii="Consolas" w:hAnsi="Consolas"/>
-          <w:b/>
-          <w:i w:val="0"/>
-          <w:color w:val="0066CC"/>
-          <w:sz w:val="22"/>
-        </w:rPr>
         <w:t>improving</w:t>
       </w:r>
       <w:r>
@@ -1269,7 +1250,7 @@
           <w:i w:val="0"/>
           <w:sz w:val="22"/>
         </w:rPr>
-        <w:t xml:space="preserve"> outline consistency across iterations.</w:t>
+        <w:t xml:space="preserve"> consistency across versions.</w:t>
       </w:r>
     </w:p>
     <w:p>

</xml_diff>